<commit_message>
Add user components and improve Exemplo controller
Introduce foundational user module (UserController, UserDTO, UserResponseDTO, UserService, UserRepository, UserException) and enhance ExemploController to return ResponseEntity with proper status codes and exception handling. Update ExemploRepository formatting, adjust application.yaml datasource (database name and username), and remove empty metadata blocks from pom.xml. Also include an updated binary document (InHomeHub - Documento Oficial.docx). These changes add user scaffolding and improve API error responses.
</commit_message>
<xml_diff>
--- a/Documentação/InHomeHub - Documento Oficial.docx
+++ b/Documentação/InHomeHub - Documento Oficial.docx
@@ -3010,6 +3010,2225 @@
     <w:p>
       <w:pPr>
         <w:rPr>
+          <w:b/>
+          <w:bCs/>
+          <w:lang w:val="pt-BR"/>
+        </w:rPr>
+      </w:pPr>
+      <w:r>
+        <w:rPr>
+          <w:b/>
+          <w:bCs/>
+          <w:lang w:val="pt-BR"/>
+        </w:rPr>
+        <w:t>11.</w:t>
+      </w:r>
+      <w:r>
+        <w:rPr>
+          <w:b/>
+          <w:bCs/>
+          <w:lang w:val="pt-BR"/>
+        </w:rPr>
+        <w:t xml:space="preserve"> Estrutura do projeto Front-</w:t>
+      </w:r>
+      <w:proofErr w:type="spellStart"/>
+      <w:r>
+        <w:rPr>
+          <w:b/>
+          <w:bCs/>
+          <w:lang w:val="pt-BR"/>
+        </w:rPr>
+        <w:t>end</w:t>
+      </w:r>
+      <w:proofErr w:type="spellEnd"/>
+    </w:p>
+    <w:p>
+      <w:pPr>
+        <w:rPr>
+          <w:lang w:val="pt-BR"/>
+        </w:rPr>
+      </w:pPr>
+      <w:proofErr w:type="spellStart"/>
+      <w:r>
+        <w:rPr>
+          <w:lang w:val="pt-BR"/>
+        </w:rPr>
+        <w:t>src</w:t>
+      </w:r>
+      <w:proofErr w:type="spellEnd"/>
+      <w:r>
+        <w:rPr>
+          <w:lang w:val="pt-BR"/>
+        </w:rPr>
+        <w:t>/</w:t>
+      </w:r>
+    </w:p>
+    <w:p>
+      <w:pPr>
+        <w:rPr>
+          <w:lang w:val="pt-BR"/>
+        </w:rPr>
+      </w:pPr>
+      <w:r>
+        <w:rPr>
+          <w:rFonts w:ascii="Arial" w:hAnsi="Arial" w:cs="Arial"/>
+          <w:lang w:val="pt-BR"/>
+        </w:rPr>
+        <w:t>├</w:t>
+      </w:r>
+      <w:r>
+        <w:rPr>
+          <w:rFonts w:ascii="Aptos" w:hAnsi="Aptos" w:cs="Aptos"/>
+          <w:lang w:val="pt-BR"/>
+        </w:rPr>
+        <w:t>──</w:t>
+      </w:r>
+      <w:r>
+        <w:rPr>
+          <w:lang w:val="pt-BR"/>
+        </w:rPr>
+        <w:t xml:space="preserve"> api/</w:t>
+      </w:r>
+    </w:p>
+    <w:p>
+      <w:pPr>
+        <w:rPr>
+          <w:lang w:val="pt-BR"/>
+        </w:rPr>
+      </w:pPr>
+      <w:r>
+        <w:rPr>
+          <w:lang w:val="pt-BR"/>
+        </w:rPr>
+        <w:t xml:space="preserve">│   </w:t>
+      </w:r>
+      <w:r>
+        <w:rPr>
+          <w:rFonts w:ascii="Arial" w:hAnsi="Arial" w:cs="Arial"/>
+          <w:lang w:val="pt-BR"/>
+        </w:rPr>
+        <w:t>├</w:t>
+      </w:r>
+      <w:r>
+        <w:rPr>
+          <w:rFonts w:ascii="Aptos" w:hAnsi="Aptos" w:cs="Aptos"/>
+          <w:lang w:val="pt-BR"/>
+        </w:rPr>
+        <w:t>──</w:t>
+      </w:r>
+      <w:r>
+        <w:rPr>
+          <w:lang w:val="pt-BR"/>
+        </w:rPr>
+        <w:t xml:space="preserve"> </w:t>
+      </w:r>
+      <w:proofErr w:type="spellStart"/>
+      <w:r>
+        <w:rPr>
+          <w:lang w:val="pt-BR"/>
+        </w:rPr>
+        <w:t>client.ts</w:t>
+      </w:r>
+      <w:proofErr w:type="spellEnd"/>
+      <w:r>
+        <w:rPr>
+          <w:lang w:val="pt-BR"/>
+        </w:rPr>
+        <w:t xml:space="preserve">              # </w:t>
+      </w:r>
+      <w:proofErr w:type="spellStart"/>
+      <w:r>
+        <w:rPr>
+          <w:lang w:val="pt-BR"/>
+        </w:rPr>
+        <w:t>Axios</w:t>
+      </w:r>
+      <w:proofErr w:type="spellEnd"/>
+      <w:r>
+        <w:rPr>
+          <w:lang w:val="pt-BR"/>
+        </w:rPr>
+        <w:t xml:space="preserve"> configurado</w:t>
+      </w:r>
+    </w:p>
+    <w:p>
+      <w:pPr>
+        <w:rPr>
+          <w:lang w:val="pt-BR"/>
+        </w:rPr>
+      </w:pPr>
+      <w:r>
+        <w:rPr>
+          <w:lang w:val="pt-BR"/>
+        </w:rPr>
+        <w:t xml:space="preserve">│   └── </w:t>
+      </w:r>
+      <w:proofErr w:type="spellStart"/>
+      <w:r>
+        <w:rPr>
+          <w:lang w:val="pt-BR"/>
+        </w:rPr>
+        <w:t>services</w:t>
+      </w:r>
+      <w:proofErr w:type="spellEnd"/>
+      <w:r>
+        <w:rPr>
+          <w:lang w:val="pt-BR"/>
+        </w:rPr>
+        <w:t>/</w:t>
+      </w:r>
+    </w:p>
+    <w:p>
+      <w:pPr>
+        <w:rPr>
+          <w:lang w:val="pt-BR"/>
+        </w:rPr>
+      </w:pPr>
+      <w:r>
+        <w:rPr>
+          <w:lang w:val="pt-BR"/>
+        </w:rPr>
+        <w:t xml:space="preserve">│       </w:t>
+      </w:r>
+      <w:r>
+        <w:rPr>
+          <w:rFonts w:ascii="Arial" w:hAnsi="Arial" w:cs="Arial"/>
+          <w:lang w:val="pt-BR"/>
+        </w:rPr>
+        <w:t>├</w:t>
+      </w:r>
+      <w:r>
+        <w:rPr>
+          <w:rFonts w:ascii="Aptos" w:hAnsi="Aptos" w:cs="Aptos"/>
+          <w:lang w:val="pt-BR"/>
+        </w:rPr>
+        <w:t>──</w:t>
+      </w:r>
+      <w:r>
+        <w:rPr>
+          <w:lang w:val="pt-BR"/>
+        </w:rPr>
+        <w:t xml:space="preserve"> </w:t>
+      </w:r>
+      <w:proofErr w:type="spellStart"/>
+      <w:proofErr w:type="gramStart"/>
+      <w:r>
+        <w:rPr>
+          <w:lang w:val="pt-BR"/>
+        </w:rPr>
+        <w:t>auth.service</w:t>
+      </w:r>
+      <w:proofErr w:type="gramEnd"/>
+      <w:r>
+        <w:rPr>
+          <w:lang w:val="pt-BR"/>
+        </w:rPr>
+        <w:t>.ts</w:t>
+      </w:r>
+      <w:proofErr w:type="spellEnd"/>
+    </w:p>
+    <w:p>
+      <w:pPr>
+        <w:rPr>
+          <w:lang w:val="pt-BR"/>
+        </w:rPr>
+      </w:pPr>
+      <w:r>
+        <w:rPr>
+          <w:lang w:val="pt-BR"/>
+        </w:rPr>
+        <w:t xml:space="preserve">│       </w:t>
+      </w:r>
+      <w:r>
+        <w:rPr>
+          <w:rFonts w:ascii="Arial" w:hAnsi="Arial" w:cs="Arial"/>
+          <w:lang w:val="pt-BR"/>
+        </w:rPr>
+        <w:t>├</w:t>
+      </w:r>
+      <w:r>
+        <w:rPr>
+          <w:rFonts w:ascii="Aptos" w:hAnsi="Aptos" w:cs="Aptos"/>
+          <w:lang w:val="pt-BR"/>
+        </w:rPr>
+        <w:t>──</w:t>
+      </w:r>
+      <w:r>
+        <w:rPr>
+          <w:lang w:val="pt-BR"/>
+        </w:rPr>
+        <w:t xml:space="preserve"> </w:t>
+      </w:r>
+      <w:proofErr w:type="spellStart"/>
+      <w:proofErr w:type="gramStart"/>
+      <w:r>
+        <w:rPr>
+          <w:lang w:val="pt-BR"/>
+        </w:rPr>
+        <w:t>morador.service</w:t>
+      </w:r>
+      <w:proofErr w:type="gramEnd"/>
+      <w:r>
+        <w:rPr>
+          <w:lang w:val="pt-BR"/>
+        </w:rPr>
+        <w:t>.ts</w:t>
+      </w:r>
+      <w:proofErr w:type="spellEnd"/>
+    </w:p>
+    <w:p>
+      <w:pPr>
+        <w:rPr>
+          <w:lang w:val="pt-BR"/>
+        </w:rPr>
+      </w:pPr>
+      <w:r>
+        <w:rPr>
+          <w:lang w:val="pt-BR"/>
+        </w:rPr>
+        <w:t xml:space="preserve">│       </w:t>
+      </w:r>
+      <w:r>
+        <w:rPr>
+          <w:rFonts w:ascii="Arial" w:hAnsi="Arial" w:cs="Arial"/>
+          <w:lang w:val="pt-BR"/>
+        </w:rPr>
+        <w:t>├</w:t>
+      </w:r>
+      <w:r>
+        <w:rPr>
+          <w:rFonts w:ascii="Aptos" w:hAnsi="Aptos" w:cs="Aptos"/>
+          <w:lang w:val="pt-BR"/>
+        </w:rPr>
+        <w:t>──</w:t>
+      </w:r>
+      <w:r>
+        <w:rPr>
+          <w:lang w:val="pt-BR"/>
+        </w:rPr>
+        <w:t xml:space="preserve"> </w:t>
+      </w:r>
+      <w:proofErr w:type="spellStart"/>
+      <w:proofErr w:type="gramStart"/>
+      <w:r>
+        <w:rPr>
+          <w:lang w:val="pt-BR"/>
+        </w:rPr>
+        <w:t>votacao.service</w:t>
+      </w:r>
+      <w:proofErr w:type="gramEnd"/>
+      <w:r>
+        <w:rPr>
+          <w:lang w:val="pt-BR"/>
+        </w:rPr>
+        <w:t>.ts</w:t>
+      </w:r>
+      <w:proofErr w:type="spellEnd"/>
+    </w:p>
+    <w:p>
+      <w:pPr>
+        <w:rPr>
+          <w:lang w:val="pt-BR"/>
+        </w:rPr>
+      </w:pPr>
+      <w:r>
+        <w:rPr>
+          <w:lang w:val="pt-BR"/>
+        </w:rPr>
+        <w:t xml:space="preserve">│       </w:t>
+      </w:r>
+      <w:r>
+        <w:rPr>
+          <w:rFonts w:ascii="Arial" w:hAnsi="Arial" w:cs="Arial"/>
+          <w:lang w:val="pt-BR"/>
+        </w:rPr>
+        <w:t>├</w:t>
+      </w:r>
+      <w:r>
+        <w:rPr>
+          <w:rFonts w:ascii="Aptos" w:hAnsi="Aptos" w:cs="Aptos"/>
+          <w:lang w:val="pt-BR"/>
+        </w:rPr>
+        <w:t>──</w:t>
+      </w:r>
+      <w:r>
+        <w:rPr>
+          <w:lang w:val="pt-BR"/>
+        </w:rPr>
+        <w:t xml:space="preserve"> </w:t>
+      </w:r>
+      <w:proofErr w:type="spellStart"/>
+      <w:proofErr w:type="gramStart"/>
+      <w:r>
+        <w:rPr>
+          <w:lang w:val="pt-BR"/>
+        </w:rPr>
+        <w:t>comunicado.service</w:t>
+      </w:r>
+      <w:proofErr w:type="gramEnd"/>
+      <w:r>
+        <w:rPr>
+          <w:lang w:val="pt-BR"/>
+        </w:rPr>
+        <w:t>.ts</w:t>
+      </w:r>
+      <w:proofErr w:type="spellEnd"/>
+    </w:p>
+    <w:p>
+      <w:r>
+        <w:t xml:space="preserve">│       └── </w:t>
+      </w:r>
+      <w:proofErr w:type="spellStart"/>
+      <w:proofErr w:type="gramStart"/>
+      <w:r>
+        <w:t>conflito.service</w:t>
+      </w:r>
+      <w:proofErr w:type="gramEnd"/>
+      <w:r>
+        <w:t>.ts</w:t>
+      </w:r>
+      <w:proofErr w:type="spellEnd"/>
+    </w:p>
+    <w:p>
+      <w:r>
+        <w:t>│</w:t>
+      </w:r>
+    </w:p>
+    <w:p>
+      <w:r>
+        <w:rPr>
+          <w:rFonts w:ascii="Arial" w:hAnsi="Arial" w:cs="Arial"/>
+        </w:rPr>
+        <w:t>├</w:t>
+      </w:r>
+      <w:r>
+        <w:rPr>
+          <w:rFonts w:ascii="Aptos" w:hAnsi="Aptos" w:cs="Aptos"/>
+        </w:rPr>
+        <w:t>──</w:t>
+      </w:r>
+      <w:r>
+        <w:t xml:space="preserve"> components/</w:t>
+      </w:r>
+    </w:p>
+    <w:p>
+      <w:r>
+        <w:t xml:space="preserve">│   </w:t>
+      </w:r>
+      <w:r>
+        <w:rPr>
+          <w:rFonts w:ascii="Arial" w:hAnsi="Arial" w:cs="Arial"/>
+        </w:rPr>
+        <w:t>├</w:t>
+      </w:r>
+      <w:r>
+        <w:rPr>
+          <w:rFonts w:ascii="Aptos" w:hAnsi="Aptos" w:cs="Aptos"/>
+        </w:rPr>
+        <w:t>──</w:t>
+      </w:r>
+      <w:r>
+        <w:t xml:space="preserve"> </w:t>
+      </w:r>
+      <w:proofErr w:type="spellStart"/>
+      <w:r>
+        <w:t>ui</w:t>
+      </w:r>
+      <w:proofErr w:type="spellEnd"/>
+      <w:r>
+        <w:t>/                    # Button, Input, Card, Modal</w:t>
+      </w:r>
+    </w:p>
+    <w:p>
+      <w:r>
+        <w:t>│   └── layout/                # Header, Sidebar, Footer</w:t>
+      </w:r>
+    </w:p>
+    <w:p>
+      <w:r>
+        <w:t>│</w:t>
+      </w:r>
+    </w:p>
+    <w:p>
+      <w:r>
+        <w:rPr>
+          <w:rFonts w:ascii="Arial" w:hAnsi="Arial" w:cs="Arial"/>
+        </w:rPr>
+        <w:t>├</w:t>
+      </w:r>
+      <w:r>
+        <w:rPr>
+          <w:rFonts w:ascii="Aptos" w:hAnsi="Aptos" w:cs="Aptos"/>
+        </w:rPr>
+        <w:t>──</w:t>
+      </w:r>
+      <w:r>
+        <w:t xml:space="preserve"> features/                  # </w:t>
+      </w:r>
+      <w:proofErr w:type="spellStart"/>
+      <w:r>
+        <w:t>Funcionalidades</w:t>
+      </w:r>
+      <w:proofErr w:type="spellEnd"/>
+      <w:r>
+        <w:t xml:space="preserve"> </w:t>
+      </w:r>
+      <w:proofErr w:type="spellStart"/>
+      <w:r>
+        <w:t>principais</w:t>
+      </w:r>
+      <w:proofErr w:type="spellEnd"/>
+    </w:p>
+    <w:p>
+      <w:r>
+        <w:t xml:space="preserve">│   </w:t>
+      </w:r>
+      <w:r>
+        <w:rPr>
+          <w:rFonts w:ascii="Arial" w:hAnsi="Arial" w:cs="Arial"/>
+        </w:rPr>
+        <w:t>├</w:t>
+      </w:r>
+      <w:r>
+        <w:rPr>
+          <w:rFonts w:ascii="Aptos" w:hAnsi="Aptos" w:cs="Aptos"/>
+        </w:rPr>
+        <w:t>──</w:t>
+      </w:r>
+      <w:r>
+        <w:t xml:space="preserve"> auth/                  # Login, </w:t>
+      </w:r>
+      <w:proofErr w:type="spellStart"/>
+      <w:r>
+        <w:t>Registro</w:t>
+      </w:r>
+      <w:proofErr w:type="spellEnd"/>
+    </w:p>
+    <w:p>
+      <w:r>
+        <w:t xml:space="preserve">│   </w:t>
+      </w:r>
+      <w:r>
+        <w:rPr>
+          <w:rFonts w:ascii="Arial" w:hAnsi="Arial" w:cs="Arial"/>
+        </w:rPr>
+        <w:t>├</w:t>
+      </w:r>
+      <w:r>
+        <w:rPr>
+          <w:rFonts w:ascii="Aptos" w:hAnsi="Aptos" w:cs="Aptos"/>
+        </w:rPr>
+        <w:t>──</w:t>
+      </w:r>
+      <w:r>
+        <w:t xml:space="preserve"> dashboard/             # </w:t>
+      </w:r>
+      <w:proofErr w:type="spellStart"/>
+      <w:r>
+        <w:t>Painel</w:t>
+      </w:r>
+      <w:proofErr w:type="spellEnd"/>
+      <w:r>
+        <w:t xml:space="preserve"> principal</w:t>
+      </w:r>
+    </w:p>
+    <w:p>
+      <w:pPr>
+        <w:rPr>
+          <w:lang w:val="pt-BR"/>
+        </w:rPr>
+      </w:pPr>
+      <w:r>
+        <w:rPr>
+          <w:lang w:val="pt-BR"/>
+        </w:rPr>
+        <w:t xml:space="preserve">│   </w:t>
+      </w:r>
+      <w:r>
+        <w:rPr>
+          <w:rFonts w:ascii="Arial" w:hAnsi="Arial" w:cs="Arial"/>
+          <w:lang w:val="pt-BR"/>
+        </w:rPr>
+        <w:t>├</w:t>
+      </w:r>
+      <w:r>
+        <w:rPr>
+          <w:rFonts w:ascii="Aptos" w:hAnsi="Aptos" w:cs="Aptos"/>
+          <w:lang w:val="pt-BR"/>
+        </w:rPr>
+        <w:t>──</w:t>
+      </w:r>
+      <w:r>
+        <w:rPr>
+          <w:lang w:val="pt-BR"/>
+        </w:rPr>
+        <w:t xml:space="preserve"> moradores/             # Gest</w:t>
+      </w:r>
+      <w:r>
+        <w:rPr>
+          <w:rFonts w:ascii="Aptos" w:hAnsi="Aptos" w:cs="Aptos"/>
+          <w:lang w:val="pt-BR"/>
+        </w:rPr>
+        <w:t>ã</w:t>
+      </w:r>
+      <w:r>
+        <w:rPr>
+          <w:lang w:val="pt-BR"/>
+        </w:rPr>
+        <w:t>o de moradores</w:t>
+      </w:r>
+    </w:p>
+    <w:p>
+      <w:pPr>
+        <w:rPr>
+          <w:lang w:val="pt-BR"/>
+        </w:rPr>
+      </w:pPr>
+      <w:r>
+        <w:rPr>
+          <w:lang w:val="pt-BR"/>
+        </w:rPr>
+        <w:t xml:space="preserve">│   </w:t>
+      </w:r>
+      <w:r>
+        <w:rPr>
+          <w:rFonts w:ascii="Arial" w:hAnsi="Arial" w:cs="Arial"/>
+          <w:lang w:val="pt-BR"/>
+        </w:rPr>
+        <w:t>├</w:t>
+      </w:r>
+      <w:r>
+        <w:rPr>
+          <w:rFonts w:ascii="Aptos" w:hAnsi="Aptos" w:cs="Aptos"/>
+          <w:lang w:val="pt-BR"/>
+        </w:rPr>
+        <w:t>──</w:t>
+      </w:r>
+      <w:r>
+        <w:rPr>
+          <w:lang w:val="pt-BR"/>
+        </w:rPr>
+        <w:t xml:space="preserve"> </w:t>
+      </w:r>
+      <w:proofErr w:type="spellStart"/>
+      <w:r>
+        <w:rPr>
+          <w:lang w:val="pt-BR"/>
+        </w:rPr>
+        <w:t>votacoes</w:t>
+      </w:r>
+      <w:proofErr w:type="spellEnd"/>
+      <w:r>
+        <w:rPr>
+          <w:lang w:val="pt-BR"/>
+        </w:rPr>
+        <w:t>/              # Sistema de vota</w:t>
+      </w:r>
+      <w:r>
+        <w:rPr>
+          <w:rFonts w:ascii="Aptos" w:hAnsi="Aptos" w:cs="Aptos"/>
+          <w:lang w:val="pt-BR"/>
+        </w:rPr>
+        <w:t>çã</w:t>
+      </w:r>
+      <w:r>
+        <w:rPr>
+          <w:lang w:val="pt-BR"/>
+        </w:rPr>
+        <w:t>o</w:t>
+      </w:r>
+    </w:p>
+    <w:p>
+      <w:pPr>
+        <w:rPr>
+          <w:lang w:val="pt-BR"/>
+        </w:rPr>
+      </w:pPr>
+      <w:r>
+        <w:rPr>
+          <w:lang w:val="pt-BR"/>
+        </w:rPr>
+        <w:lastRenderedPageBreak/>
+        <w:t xml:space="preserve">│   </w:t>
+      </w:r>
+      <w:r>
+        <w:rPr>
+          <w:rFonts w:ascii="Arial" w:hAnsi="Arial" w:cs="Arial"/>
+          <w:lang w:val="pt-BR"/>
+        </w:rPr>
+        <w:t>├</w:t>
+      </w:r>
+      <w:r>
+        <w:rPr>
+          <w:rFonts w:ascii="Aptos" w:hAnsi="Aptos" w:cs="Aptos"/>
+          <w:lang w:val="pt-BR"/>
+        </w:rPr>
+        <w:t>──</w:t>
+      </w:r>
+      <w:r>
+        <w:rPr>
+          <w:lang w:val="pt-BR"/>
+        </w:rPr>
+        <w:t xml:space="preserve"> comunicados/           # Avisos e comunicados</w:t>
+      </w:r>
+    </w:p>
+    <w:p>
+      <w:pPr>
+        <w:rPr>
+          <w:lang w:val="pt-BR"/>
+        </w:rPr>
+      </w:pPr>
+      <w:r>
+        <w:rPr>
+          <w:lang w:val="pt-BR"/>
+        </w:rPr>
+        <w:t xml:space="preserve">│   </w:t>
+      </w:r>
+      <w:r>
+        <w:rPr>
+          <w:rFonts w:ascii="Arial" w:hAnsi="Arial" w:cs="Arial"/>
+          <w:lang w:val="pt-BR"/>
+        </w:rPr>
+        <w:t>├</w:t>
+      </w:r>
+      <w:r>
+        <w:rPr>
+          <w:rFonts w:ascii="Aptos" w:hAnsi="Aptos" w:cs="Aptos"/>
+          <w:lang w:val="pt-BR"/>
+        </w:rPr>
+        <w:t>──</w:t>
+      </w:r>
+      <w:r>
+        <w:rPr>
+          <w:lang w:val="pt-BR"/>
+        </w:rPr>
+        <w:t xml:space="preserve"> conflitos/             # Gest</w:t>
+      </w:r>
+      <w:r>
+        <w:rPr>
+          <w:rFonts w:ascii="Aptos" w:hAnsi="Aptos" w:cs="Aptos"/>
+          <w:lang w:val="pt-BR"/>
+        </w:rPr>
+        <w:t>ã</w:t>
+      </w:r>
+      <w:r>
+        <w:rPr>
+          <w:lang w:val="pt-BR"/>
+        </w:rPr>
+        <w:t>o de conflitos</w:t>
+      </w:r>
+    </w:p>
+    <w:p>
+      <w:pPr>
+        <w:rPr>
+          <w:lang w:val="pt-BR"/>
+        </w:rPr>
+      </w:pPr>
+      <w:r>
+        <w:rPr>
+          <w:lang w:val="pt-BR"/>
+        </w:rPr>
+        <w:t>│   └── financeiro/            # Taxas e pagamentos (futuro)</w:t>
+      </w:r>
+    </w:p>
+    <w:p>
+      <w:r>
+        <w:t>│</w:t>
+      </w:r>
+    </w:p>
+    <w:p>
+      <w:r>
+        <w:rPr>
+          <w:rFonts w:ascii="Arial" w:hAnsi="Arial" w:cs="Arial"/>
+        </w:rPr>
+        <w:t>├</w:t>
+      </w:r>
+      <w:r>
+        <w:rPr>
+          <w:rFonts w:ascii="Aptos" w:hAnsi="Aptos" w:cs="Aptos"/>
+        </w:rPr>
+        <w:t>──</w:t>
+      </w:r>
+      <w:r>
+        <w:t xml:space="preserve"> shared/</w:t>
+      </w:r>
+    </w:p>
+    <w:p>
+      <w:r>
+        <w:t xml:space="preserve">│   </w:t>
+      </w:r>
+      <w:r>
+        <w:rPr>
+          <w:rFonts w:ascii="Arial" w:hAnsi="Arial" w:cs="Arial"/>
+        </w:rPr>
+        <w:t>├</w:t>
+      </w:r>
+      <w:r>
+        <w:rPr>
+          <w:rFonts w:ascii="Aptos" w:hAnsi="Aptos" w:cs="Aptos"/>
+        </w:rPr>
+        <w:t>──</w:t>
+      </w:r>
+      <w:r>
+        <w:t xml:space="preserve"> hooks/                 # </w:t>
+      </w:r>
+      <w:proofErr w:type="spellStart"/>
+      <w:r>
+        <w:t>useAuth</w:t>
+      </w:r>
+      <w:proofErr w:type="spellEnd"/>
+      <w:r>
+        <w:t xml:space="preserve">, </w:t>
+      </w:r>
+      <w:proofErr w:type="spellStart"/>
+      <w:r>
+        <w:t>useFetch</w:t>
+      </w:r>
+      <w:proofErr w:type="spellEnd"/>
+    </w:p>
+    <w:p>
+      <w:r>
+        <w:t xml:space="preserve">│   </w:t>
+      </w:r>
+      <w:r>
+        <w:rPr>
+          <w:rFonts w:ascii="Arial" w:hAnsi="Arial" w:cs="Arial"/>
+        </w:rPr>
+        <w:t>├</w:t>
+      </w:r>
+      <w:r>
+        <w:rPr>
+          <w:rFonts w:ascii="Aptos" w:hAnsi="Aptos" w:cs="Aptos"/>
+        </w:rPr>
+        <w:t>──</w:t>
+      </w:r>
+      <w:r>
+        <w:t xml:space="preserve"> types/                 # Interfaces TypeScript</w:t>
+      </w:r>
+    </w:p>
+    <w:p>
+      <w:pPr>
+        <w:rPr>
+          <w:lang w:val="pt-BR"/>
+        </w:rPr>
+      </w:pPr>
+      <w:r>
+        <w:rPr>
+          <w:lang w:val="pt-BR"/>
+        </w:rPr>
+        <w:t xml:space="preserve">│   └── </w:t>
+      </w:r>
+      <w:proofErr w:type="spellStart"/>
+      <w:r>
+        <w:rPr>
+          <w:lang w:val="pt-BR"/>
+        </w:rPr>
+        <w:t>utils</w:t>
+      </w:r>
+      <w:proofErr w:type="spellEnd"/>
+      <w:r>
+        <w:rPr>
+          <w:lang w:val="pt-BR"/>
+        </w:rPr>
+        <w:t>/                 # Formatadores, validadores</w:t>
+      </w:r>
+    </w:p>
+    <w:p>
+      <w:pPr>
+        <w:rPr>
+          <w:lang w:val="pt-BR"/>
+        </w:rPr>
+      </w:pPr>
+      <w:r>
+        <w:rPr>
+          <w:lang w:val="pt-BR"/>
+        </w:rPr>
+        <w:t>│</w:t>
+      </w:r>
+    </w:p>
+    <w:p>
+      <w:pPr>
+        <w:rPr>
+          <w:lang w:val="pt-BR"/>
+        </w:rPr>
+      </w:pPr>
+      <w:r>
+        <w:rPr>
+          <w:rFonts w:ascii="Arial" w:hAnsi="Arial" w:cs="Arial"/>
+          <w:lang w:val="pt-BR"/>
+        </w:rPr>
+        <w:t>├</w:t>
+      </w:r>
+      <w:r>
+        <w:rPr>
+          <w:rFonts w:ascii="Aptos" w:hAnsi="Aptos" w:cs="Aptos"/>
+          <w:lang w:val="pt-BR"/>
+        </w:rPr>
+        <w:t>──</w:t>
+      </w:r>
+      <w:r>
+        <w:rPr>
+          <w:lang w:val="pt-BR"/>
+        </w:rPr>
+        <w:t xml:space="preserve"> </w:t>
+      </w:r>
+      <w:proofErr w:type="spellStart"/>
+      <w:r>
+        <w:rPr>
+          <w:lang w:val="pt-BR"/>
+        </w:rPr>
+        <w:t>routes</w:t>
+      </w:r>
+      <w:proofErr w:type="spellEnd"/>
+      <w:r>
+        <w:rPr>
+          <w:lang w:val="pt-BR"/>
+        </w:rPr>
+        <w:t>/</w:t>
+      </w:r>
+    </w:p>
+    <w:p>
+      <w:pPr>
+        <w:rPr>
+          <w:lang w:val="pt-BR"/>
+        </w:rPr>
+      </w:pPr>
+      <w:r>
+        <w:rPr>
+          <w:lang w:val="pt-BR"/>
+        </w:rPr>
+        <w:t xml:space="preserve">│   └── </w:t>
+      </w:r>
+      <w:proofErr w:type="spellStart"/>
+      <w:r>
+        <w:rPr>
+          <w:lang w:val="pt-BR"/>
+        </w:rPr>
+        <w:t>index.tsx</w:t>
+      </w:r>
+      <w:proofErr w:type="spellEnd"/>
+      <w:r>
+        <w:rPr>
+          <w:lang w:val="pt-BR"/>
+        </w:rPr>
+        <w:t xml:space="preserve">              # Configuração de rotas</w:t>
+      </w:r>
+    </w:p>
+    <w:p>
+      <w:pPr>
+        <w:rPr>
+          <w:lang w:val="pt-BR"/>
+        </w:rPr>
+      </w:pPr>
+      <w:r>
+        <w:rPr>
+          <w:lang w:val="pt-BR"/>
+        </w:rPr>
+        <w:t>│</w:t>
+      </w:r>
+    </w:p>
+    <w:p>
+      <w:pPr>
+        <w:rPr>
+          <w:lang w:val="pt-BR"/>
+        </w:rPr>
+      </w:pPr>
+      <w:r>
+        <w:rPr>
+          <w:rFonts w:ascii="Arial" w:hAnsi="Arial" w:cs="Arial"/>
+          <w:lang w:val="pt-BR"/>
+        </w:rPr>
+        <w:t>├</w:t>
+      </w:r>
+      <w:r>
+        <w:rPr>
+          <w:rFonts w:ascii="Aptos" w:hAnsi="Aptos" w:cs="Aptos"/>
+          <w:lang w:val="pt-BR"/>
+        </w:rPr>
+        <w:t>──</w:t>
+      </w:r>
+      <w:r>
+        <w:rPr>
+          <w:lang w:val="pt-BR"/>
+        </w:rPr>
+        <w:t xml:space="preserve"> </w:t>
+      </w:r>
+      <w:proofErr w:type="spellStart"/>
+      <w:r>
+        <w:rPr>
+          <w:lang w:val="pt-BR"/>
+        </w:rPr>
+        <w:t>App.tsx</w:t>
+      </w:r>
+      <w:proofErr w:type="spellEnd"/>
+    </w:p>
+    <w:p>
+      <w:pPr>
+        <w:rPr>
+          <w:lang w:val="pt-BR"/>
+        </w:rPr>
+      </w:pPr>
+      <w:r>
+        <w:rPr>
+          <w:lang w:val="pt-BR"/>
+        </w:rPr>
+        <w:t xml:space="preserve">└── </w:t>
+      </w:r>
+      <w:proofErr w:type="spellStart"/>
+      <w:r>
+        <w:rPr>
+          <w:lang w:val="pt-BR"/>
+        </w:rPr>
+        <w:t>main.tsx</w:t>
+      </w:r>
+      <w:proofErr w:type="spellEnd"/>
+    </w:p>
+    <w:p>
+      <w:pPr>
+        <w:rPr>
+          <w:b/>
+          <w:bCs/>
+          <w:lang w:val="pt-BR"/>
+        </w:rPr>
+      </w:pPr>
+    </w:p>
+    <w:p>
+      <w:pPr>
+        <w:rPr>
+          <w:b/>
+          <w:bCs/>
+          <w:lang w:val="pt-BR"/>
+        </w:rPr>
+      </w:pPr>
+      <w:r>
+        <w:rPr>
+          <w:b/>
+          <w:bCs/>
+          <w:lang w:val="pt-BR"/>
+        </w:rPr>
+        <w:t>12. Estrutura do Projeto Back-</w:t>
+      </w:r>
+      <w:proofErr w:type="spellStart"/>
+      <w:r>
+        <w:rPr>
+          <w:b/>
+          <w:bCs/>
+          <w:lang w:val="pt-BR"/>
+        </w:rPr>
+        <w:t>end</w:t>
+      </w:r>
+      <w:proofErr w:type="spellEnd"/>
+    </w:p>
+    <w:p>
+      <w:pPr>
+        <w:rPr>
+          <w:b/>
+          <w:bCs/>
+          <w:lang w:val="pt-BR"/>
+        </w:rPr>
+      </w:pPr>
+      <w:proofErr w:type="spellStart"/>
+      <w:r>
+        <w:rPr>
+          <w:lang w:val="pt-BR"/>
+        </w:rPr>
+        <w:t>src</w:t>
+      </w:r>
+      <w:proofErr w:type="spellEnd"/>
+      <w:r>
+        <w:rPr>
+          <w:lang w:val="pt-BR"/>
+        </w:rPr>
+        <w:t>/</w:t>
+      </w:r>
+    </w:p>
+    <w:p>
+      <w:pPr>
+        <w:rPr>
+          <w:lang w:val="pt-BR"/>
+        </w:rPr>
+      </w:pPr>
+      <w:r>
+        <w:rPr>
+          <w:lang w:val="pt-BR"/>
+        </w:rPr>
+        <w:t xml:space="preserve">└── </w:t>
+      </w:r>
+      <w:proofErr w:type="spellStart"/>
+      <w:r>
+        <w:rPr>
+          <w:lang w:val="pt-BR"/>
+        </w:rPr>
+        <w:t>main</w:t>
+      </w:r>
+      <w:proofErr w:type="spellEnd"/>
+      <w:r>
+        <w:rPr>
+          <w:lang w:val="pt-BR"/>
+        </w:rPr>
+        <w:t>/</w:t>
+      </w:r>
+    </w:p>
+    <w:p>
+      <w:pPr>
+        <w:rPr>
+          <w:lang w:val="pt-BR"/>
+        </w:rPr>
+      </w:pPr>
+      <w:r>
+        <w:rPr>
+          <w:lang w:val="pt-BR"/>
+        </w:rPr>
+        <w:t xml:space="preserve">    </w:t>
+      </w:r>
+      <w:r>
+        <w:rPr>
+          <w:rFonts w:ascii="Arial" w:hAnsi="Arial" w:cs="Arial"/>
+          <w:lang w:val="pt-BR"/>
+        </w:rPr>
+        <w:t>├</w:t>
+      </w:r>
+      <w:r>
+        <w:rPr>
+          <w:rFonts w:ascii="Aptos" w:hAnsi="Aptos" w:cs="Aptos"/>
+          <w:lang w:val="pt-BR"/>
+        </w:rPr>
+        <w:t>──</w:t>
+      </w:r>
+      <w:r>
+        <w:rPr>
+          <w:lang w:val="pt-BR"/>
+        </w:rPr>
+        <w:t xml:space="preserve"> </w:t>
+      </w:r>
+      <w:proofErr w:type="spellStart"/>
+      <w:r>
+        <w:rPr>
+          <w:lang w:val="pt-BR"/>
+        </w:rPr>
+        <w:t>java</w:t>
+      </w:r>
+      <w:proofErr w:type="spellEnd"/>
+      <w:r>
+        <w:rPr>
+          <w:lang w:val="pt-BR"/>
+        </w:rPr>
+        <w:t>/</w:t>
+      </w:r>
+    </w:p>
+    <w:p>
+      <w:pPr>
+        <w:rPr>
+          <w:lang w:val="pt-BR"/>
+        </w:rPr>
+      </w:pPr>
+      <w:r>
+        <w:rPr>
+          <w:lang w:val="pt-BR"/>
+        </w:rPr>
+        <w:t xml:space="preserve">    │   └── com/</w:t>
+      </w:r>
+    </w:p>
+    <w:p>
+      <w:pPr>
+        <w:rPr>
+          <w:lang w:val="pt-BR"/>
+        </w:rPr>
+      </w:pPr>
+      <w:r>
+        <w:rPr>
+          <w:lang w:val="pt-BR"/>
+        </w:rPr>
+        <w:t xml:space="preserve">    │       └── </w:t>
+      </w:r>
+      <w:proofErr w:type="spellStart"/>
+      <w:r>
+        <w:rPr>
+          <w:lang w:val="pt-BR"/>
+        </w:rPr>
+        <w:t>seuempresa</w:t>
+      </w:r>
+      <w:proofErr w:type="spellEnd"/>
+      <w:r>
+        <w:rPr>
+          <w:lang w:val="pt-BR"/>
+        </w:rPr>
+        <w:t>/</w:t>
+      </w:r>
+    </w:p>
+    <w:p>
+      <w:pPr>
+        <w:rPr>
+          <w:lang w:val="pt-BR"/>
+        </w:rPr>
+      </w:pPr>
+      <w:r>
+        <w:rPr>
+          <w:lang w:val="pt-BR"/>
+        </w:rPr>
+        <w:t xml:space="preserve">    │           └── </w:t>
+      </w:r>
+      <w:proofErr w:type="spellStart"/>
+      <w:r>
+        <w:rPr>
+          <w:lang w:val="pt-BR"/>
+        </w:rPr>
+        <w:t>seuprojeto</w:t>
+      </w:r>
+      <w:proofErr w:type="spellEnd"/>
+      <w:r>
+        <w:rPr>
+          <w:lang w:val="pt-BR"/>
+        </w:rPr>
+        <w:t>/</w:t>
+      </w:r>
+    </w:p>
+    <w:p>
+      <w:pPr>
+        <w:rPr>
+          <w:lang w:val="pt-BR"/>
+        </w:rPr>
+      </w:pPr>
+      <w:r>
+        <w:rPr>
+          <w:lang w:val="pt-BR"/>
+        </w:rPr>
+        <w:t xml:space="preserve">    │               </w:t>
+      </w:r>
+      <w:r>
+        <w:rPr>
+          <w:rFonts w:ascii="Arial" w:hAnsi="Arial" w:cs="Arial"/>
+          <w:lang w:val="pt-BR"/>
+        </w:rPr>
+        <w:t>├</w:t>
+      </w:r>
+      <w:r>
+        <w:rPr>
+          <w:rFonts w:ascii="Aptos" w:hAnsi="Aptos" w:cs="Aptos"/>
+          <w:lang w:val="pt-BR"/>
+        </w:rPr>
+        <w:t>──</w:t>
+      </w:r>
+      <w:r>
+        <w:rPr>
+          <w:lang w:val="pt-BR"/>
+        </w:rPr>
+        <w:t xml:space="preserve"> SeuProjetoApplication.java</w:t>
+      </w:r>
+    </w:p>
+    <w:p>
+      <w:pPr>
+        <w:rPr>
+          <w:lang w:val="pt-BR"/>
+        </w:rPr>
+      </w:pPr>
+      <w:r>
+        <w:rPr>
+          <w:lang w:val="pt-BR"/>
+        </w:rPr>
+        <w:t xml:space="preserve">    │               </w:t>
+      </w:r>
+      <w:r>
+        <w:rPr>
+          <w:rFonts w:ascii="Arial" w:hAnsi="Arial" w:cs="Arial"/>
+          <w:lang w:val="pt-BR"/>
+        </w:rPr>
+        <w:t>├</w:t>
+      </w:r>
+      <w:r>
+        <w:rPr>
+          <w:rFonts w:ascii="Aptos" w:hAnsi="Aptos" w:cs="Aptos"/>
+          <w:lang w:val="pt-BR"/>
+        </w:rPr>
+        <w:t>──</w:t>
+      </w:r>
+      <w:r>
+        <w:rPr>
+          <w:lang w:val="pt-BR"/>
+        </w:rPr>
+        <w:t xml:space="preserve"> </w:t>
+      </w:r>
+      <w:proofErr w:type="spellStart"/>
+      <w:r>
+        <w:rPr>
+          <w:lang w:val="pt-BR"/>
+        </w:rPr>
+        <w:t>config</w:t>
+      </w:r>
+      <w:proofErr w:type="spellEnd"/>
+      <w:r>
+        <w:rPr>
+          <w:lang w:val="pt-BR"/>
+        </w:rPr>
+        <w:t>/                # Configura</w:t>
+      </w:r>
+      <w:r>
+        <w:rPr>
+          <w:rFonts w:ascii="Aptos" w:hAnsi="Aptos" w:cs="Aptos"/>
+          <w:lang w:val="pt-BR"/>
+        </w:rPr>
+        <w:t>çõ</w:t>
+      </w:r>
+      <w:r>
+        <w:rPr>
+          <w:lang w:val="pt-BR"/>
+        </w:rPr>
+        <w:t>es (seguran</w:t>
+      </w:r>
+      <w:r>
+        <w:rPr>
+          <w:rFonts w:ascii="Aptos" w:hAnsi="Aptos" w:cs="Aptos"/>
+          <w:lang w:val="pt-BR"/>
+        </w:rPr>
+        <w:t>ç</w:t>
+      </w:r>
+      <w:r>
+        <w:rPr>
+          <w:lang w:val="pt-BR"/>
+        </w:rPr>
+        <w:t xml:space="preserve">a, CORS, </w:t>
+      </w:r>
+      <w:proofErr w:type="spellStart"/>
+      <w:r>
+        <w:rPr>
+          <w:lang w:val="pt-BR"/>
+        </w:rPr>
+        <w:t>beans</w:t>
+      </w:r>
+      <w:proofErr w:type="spellEnd"/>
+      <w:r>
+        <w:rPr>
+          <w:lang w:val="pt-BR"/>
+        </w:rPr>
+        <w:t>)</w:t>
+      </w:r>
+    </w:p>
+    <w:p>
+      <w:r>
+        <w:rPr>
+          <w:lang w:val="pt-BR"/>
+        </w:rPr>
+        <w:t xml:space="preserve">    </w:t>
+      </w:r>
+      <w:r>
+        <w:t xml:space="preserve">│               </w:t>
+      </w:r>
+      <w:r>
+        <w:rPr>
+          <w:rFonts w:ascii="Arial" w:hAnsi="Arial" w:cs="Arial"/>
+        </w:rPr>
+        <w:t>├</w:t>
+      </w:r>
+      <w:r>
+        <w:rPr>
+          <w:rFonts w:ascii="Aptos" w:hAnsi="Aptos" w:cs="Aptos"/>
+        </w:rPr>
+        <w:t>──</w:t>
+      </w:r>
+      <w:r>
+        <w:t xml:space="preserve"> controller/            # Controllers REST</w:t>
+      </w:r>
+    </w:p>
+    <w:p>
+      <w:r>
+        <w:t xml:space="preserve">    │               </w:t>
+      </w:r>
+      <w:r>
+        <w:rPr>
+          <w:rFonts w:ascii="Arial" w:hAnsi="Arial" w:cs="Arial"/>
+        </w:rPr>
+        <w:t>├</w:t>
+      </w:r>
+      <w:r>
+        <w:rPr>
+          <w:rFonts w:ascii="Aptos" w:hAnsi="Aptos" w:cs="Aptos"/>
+        </w:rPr>
+        <w:t>──</w:t>
+      </w:r>
+      <w:r>
+        <w:t xml:space="preserve"> </w:t>
+      </w:r>
+      <w:proofErr w:type="spellStart"/>
+      <w:r>
+        <w:t>dto</w:t>
+      </w:r>
+      <w:proofErr w:type="spellEnd"/>
+      <w:r>
+        <w:t>/                   # Data Transfer Objects</w:t>
+      </w:r>
+    </w:p>
+    <w:p>
+      <w:pPr>
+        <w:rPr>
+          <w:lang w:val="pt-BR"/>
+        </w:rPr>
+      </w:pPr>
+      <w:r>
+        <w:lastRenderedPageBreak/>
+        <w:t xml:space="preserve">    </w:t>
+      </w:r>
+      <w:r>
+        <w:rPr>
+          <w:lang w:val="pt-BR"/>
+        </w:rPr>
+        <w:t xml:space="preserve">│               │   └── </w:t>
+      </w:r>
+      <w:proofErr w:type="spellStart"/>
+      <w:r>
+        <w:rPr>
+          <w:lang w:val="pt-BR"/>
+        </w:rPr>
+        <w:t>request</w:t>
+      </w:r>
+      <w:proofErr w:type="spellEnd"/>
+      <w:r>
+        <w:rPr>
+          <w:lang w:val="pt-BR"/>
+        </w:rPr>
+        <w:t>/</w:t>
+      </w:r>
+    </w:p>
+    <w:p>
+      <w:pPr>
+        <w:rPr>
+          <w:lang w:val="pt-BR"/>
+        </w:rPr>
+      </w:pPr>
+      <w:r>
+        <w:rPr>
+          <w:lang w:val="pt-BR"/>
+        </w:rPr>
+        <w:t xml:space="preserve">    │               │   └── response/</w:t>
+      </w:r>
+    </w:p>
+    <w:p>
+      <w:pPr>
+        <w:rPr>
+          <w:lang w:val="pt-BR"/>
+        </w:rPr>
+      </w:pPr>
+      <w:r>
+        <w:rPr>
+          <w:lang w:val="pt-BR"/>
+        </w:rPr>
+        <w:t xml:space="preserve">    │               </w:t>
+      </w:r>
+      <w:r>
+        <w:rPr>
+          <w:rFonts w:ascii="Arial" w:hAnsi="Arial" w:cs="Arial"/>
+          <w:lang w:val="pt-BR"/>
+        </w:rPr>
+        <w:t>├</w:t>
+      </w:r>
+      <w:r>
+        <w:rPr>
+          <w:rFonts w:ascii="Aptos" w:hAnsi="Aptos" w:cs="Aptos"/>
+          <w:lang w:val="pt-BR"/>
+        </w:rPr>
+        <w:t>──</w:t>
+      </w:r>
+      <w:r>
+        <w:rPr>
+          <w:lang w:val="pt-BR"/>
+        </w:rPr>
+        <w:t xml:space="preserve"> </w:t>
+      </w:r>
+      <w:proofErr w:type="spellStart"/>
+      <w:r>
+        <w:rPr>
+          <w:lang w:val="pt-BR"/>
+        </w:rPr>
+        <w:t>entity</w:t>
+      </w:r>
+      <w:proofErr w:type="spellEnd"/>
+      <w:r>
+        <w:rPr>
+          <w:lang w:val="pt-BR"/>
+        </w:rPr>
+        <w:t>/                # Entidades JPA</w:t>
+      </w:r>
+    </w:p>
+    <w:p>
+      <w:pPr>
+        <w:rPr>
+          <w:lang w:val="pt-BR"/>
+        </w:rPr>
+      </w:pPr>
+      <w:r>
+        <w:rPr>
+          <w:lang w:val="pt-BR"/>
+        </w:rPr>
+        <w:t xml:space="preserve">    │               </w:t>
+      </w:r>
+      <w:r>
+        <w:rPr>
+          <w:rFonts w:ascii="Arial" w:hAnsi="Arial" w:cs="Arial"/>
+          <w:lang w:val="pt-BR"/>
+        </w:rPr>
+        <w:t>├</w:t>
+      </w:r>
+      <w:r>
+        <w:rPr>
+          <w:rFonts w:ascii="Aptos" w:hAnsi="Aptos" w:cs="Aptos"/>
+          <w:lang w:val="pt-BR"/>
+        </w:rPr>
+        <w:t>──</w:t>
+      </w:r>
+      <w:r>
+        <w:rPr>
+          <w:lang w:val="pt-BR"/>
+        </w:rPr>
+        <w:t xml:space="preserve"> </w:t>
+      </w:r>
+      <w:proofErr w:type="spellStart"/>
+      <w:r>
+        <w:rPr>
+          <w:lang w:val="pt-BR"/>
+        </w:rPr>
+        <w:t>exception</w:t>
+      </w:r>
+      <w:proofErr w:type="spellEnd"/>
+      <w:r>
+        <w:rPr>
+          <w:lang w:val="pt-BR"/>
+        </w:rPr>
+        <w:t>/             # Tratamento de erros</w:t>
+      </w:r>
+    </w:p>
+    <w:p>
+      <w:pPr>
+        <w:rPr>
+          <w:lang w:val="pt-BR"/>
+        </w:rPr>
+      </w:pPr>
+      <w:r>
+        <w:rPr>
+          <w:lang w:val="pt-BR"/>
+        </w:rPr>
+        <w:t xml:space="preserve">    │               </w:t>
+      </w:r>
+      <w:r>
+        <w:rPr>
+          <w:rFonts w:ascii="Arial" w:hAnsi="Arial" w:cs="Arial"/>
+          <w:lang w:val="pt-BR"/>
+        </w:rPr>
+        <w:t>├</w:t>
+      </w:r>
+      <w:r>
+        <w:rPr>
+          <w:rFonts w:ascii="Aptos" w:hAnsi="Aptos" w:cs="Aptos"/>
+          <w:lang w:val="pt-BR"/>
+        </w:rPr>
+        <w:t>──</w:t>
+      </w:r>
+      <w:r>
+        <w:rPr>
+          <w:lang w:val="pt-BR"/>
+        </w:rPr>
+        <w:t xml:space="preserve"> </w:t>
+      </w:r>
+      <w:proofErr w:type="spellStart"/>
+      <w:r>
+        <w:rPr>
+          <w:lang w:val="pt-BR"/>
+        </w:rPr>
+        <w:t>repository</w:t>
+      </w:r>
+      <w:proofErr w:type="spellEnd"/>
+      <w:r>
+        <w:rPr>
+          <w:lang w:val="pt-BR"/>
+        </w:rPr>
+        <w:t>/            # Reposit</w:t>
+      </w:r>
+      <w:r>
+        <w:rPr>
+          <w:rFonts w:ascii="Aptos" w:hAnsi="Aptos" w:cs="Aptos"/>
+          <w:lang w:val="pt-BR"/>
+        </w:rPr>
+        <w:t>ó</w:t>
+      </w:r>
+      <w:r>
+        <w:rPr>
+          <w:lang w:val="pt-BR"/>
+        </w:rPr>
+        <w:t>rios JPA</w:t>
+      </w:r>
+    </w:p>
+    <w:p>
+      <w:pPr>
+        <w:rPr>
+          <w:lang w:val="pt-BR"/>
+        </w:rPr>
+      </w:pPr>
+      <w:r>
+        <w:rPr>
+          <w:lang w:val="pt-BR"/>
+        </w:rPr>
+        <w:t xml:space="preserve">    │               </w:t>
+      </w:r>
+      <w:r>
+        <w:rPr>
+          <w:rFonts w:ascii="Arial" w:hAnsi="Arial" w:cs="Arial"/>
+          <w:lang w:val="pt-BR"/>
+        </w:rPr>
+        <w:t>├</w:t>
+      </w:r>
+      <w:r>
+        <w:rPr>
+          <w:rFonts w:ascii="Aptos" w:hAnsi="Aptos" w:cs="Aptos"/>
+          <w:lang w:val="pt-BR"/>
+        </w:rPr>
+        <w:t>──</w:t>
+      </w:r>
+      <w:r>
+        <w:rPr>
+          <w:lang w:val="pt-BR"/>
+        </w:rPr>
+        <w:t xml:space="preserve"> </w:t>
+      </w:r>
+      <w:proofErr w:type="spellStart"/>
+      <w:r>
+        <w:rPr>
+          <w:lang w:val="pt-BR"/>
+        </w:rPr>
+        <w:t>service</w:t>
+      </w:r>
+      <w:proofErr w:type="spellEnd"/>
+      <w:r>
+        <w:rPr>
+          <w:lang w:val="pt-BR"/>
+        </w:rPr>
+        <w:t>/               # Servi</w:t>
+      </w:r>
+      <w:r>
+        <w:rPr>
+          <w:rFonts w:ascii="Aptos" w:hAnsi="Aptos" w:cs="Aptos"/>
+          <w:lang w:val="pt-BR"/>
+        </w:rPr>
+        <w:t>ç</w:t>
+      </w:r>
+      <w:r>
+        <w:rPr>
+          <w:lang w:val="pt-BR"/>
+        </w:rPr>
+        <w:t>os (l</w:t>
+      </w:r>
+      <w:r>
+        <w:rPr>
+          <w:rFonts w:ascii="Aptos" w:hAnsi="Aptos" w:cs="Aptos"/>
+          <w:lang w:val="pt-BR"/>
+        </w:rPr>
+        <w:t>ó</w:t>
+      </w:r>
+      <w:r>
+        <w:rPr>
+          <w:lang w:val="pt-BR"/>
+        </w:rPr>
+        <w:t>gica de neg</w:t>
+      </w:r>
+      <w:r>
+        <w:rPr>
+          <w:rFonts w:ascii="Aptos" w:hAnsi="Aptos" w:cs="Aptos"/>
+          <w:lang w:val="pt-BR"/>
+        </w:rPr>
+        <w:t>ó</w:t>
+      </w:r>
+      <w:r>
+        <w:rPr>
+          <w:lang w:val="pt-BR"/>
+        </w:rPr>
+        <w:t>cio)</w:t>
+      </w:r>
+    </w:p>
+    <w:p>
+      <w:pPr>
+        <w:rPr>
+          <w:lang w:val="pt-BR"/>
+        </w:rPr>
+      </w:pPr>
+      <w:r>
+        <w:rPr>
+          <w:lang w:val="pt-BR"/>
+        </w:rPr>
+        <w:t xml:space="preserve">    │               </w:t>
+      </w:r>
+      <w:r>
+        <w:rPr>
+          <w:rFonts w:ascii="Arial" w:hAnsi="Arial" w:cs="Arial"/>
+          <w:lang w:val="pt-BR"/>
+        </w:rPr>
+        <w:t>├</w:t>
+      </w:r>
+      <w:r>
+        <w:rPr>
+          <w:rFonts w:ascii="Aptos" w:hAnsi="Aptos" w:cs="Aptos"/>
+          <w:lang w:val="pt-BR"/>
+        </w:rPr>
+        <w:t>──</w:t>
+      </w:r>
+      <w:r>
+        <w:rPr>
+          <w:lang w:val="pt-BR"/>
+        </w:rPr>
+        <w:t xml:space="preserve"> </w:t>
+      </w:r>
+      <w:proofErr w:type="spellStart"/>
+      <w:r>
+        <w:rPr>
+          <w:lang w:val="pt-BR"/>
+        </w:rPr>
+        <w:t>util</w:t>
+      </w:r>
+      <w:proofErr w:type="spellEnd"/>
+      <w:r>
+        <w:rPr>
+          <w:lang w:val="pt-BR"/>
+        </w:rPr>
+        <w:t>/                  # Utilit</w:t>
+      </w:r>
+      <w:r>
+        <w:rPr>
+          <w:rFonts w:ascii="Aptos" w:hAnsi="Aptos" w:cs="Aptos"/>
+          <w:lang w:val="pt-BR"/>
+        </w:rPr>
+        <w:t>á</w:t>
+      </w:r>
+      <w:r>
+        <w:rPr>
+          <w:lang w:val="pt-BR"/>
+        </w:rPr>
+        <w:t xml:space="preserve">rios e </w:t>
+      </w:r>
+      <w:proofErr w:type="spellStart"/>
+      <w:r>
+        <w:rPr>
+          <w:lang w:val="pt-BR"/>
+        </w:rPr>
+        <w:t>helpers</w:t>
+      </w:r>
+      <w:proofErr w:type="spellEnd"/>
+    </w:p>
+    <w:p>
+      <w:pPr>
+        <w:rPr>
+          <w:lang w:val="pt-BR"/>
+        </w:rPr>
+      </w:pPr>
+      <w:r>
+        <w:rPr>
+          <w:lang w:val="pt-BR"/>
+        </w:rPr>
+        <w:t xml:space="preserve">    │               └── </w:t>
+      </w:r>
+      <w:proofErr w:type="spellStart"/>
+      <w:r>
+        <w:rPr>
+          <w:lang w:val="pt-BR"/>
+        </w:rPr>
+        <w:t>security</w:t>
+      </w:r>
+      <w:proofErr w:type="spellEnd"/>
+      <w:r>
+        <w:rPr>
+          <w:lang w:val="pt-BR"/>
+        </w:rPr>
+        <w:t>/              # Configuração e classes de segurança</w:t>
+      </w:r>
+    </w:p>
+    <w:p>
+      <w:pPr>
+        <w:rPr>
+          <w:lang w:val="pt-BR"/>
+        </w:rPr>
+      </w:pPr>
+      <w:r>
+        <w:rPr>
+          <w:lang w:val="pt-BR"/>
+        </w:rPr>
+        <w:t xml:space="preserve">    └── </w:t>
+      </w:r>
+      <w:proofErr w:type="spellStart"/>
+      <w:r>
+        <w:rPr>
+          <w:lang w:val="pt-BR"/>
+        </w:rPr>
+        <w:t>resources</w:t>
+      </w:r>
+      <w:proofErr w:type="spellEnd"/>
+      <w:r>
+        <w:rPr>
+          <w:lang w:val="pt-BR"/>
+        </w:rPr>
+        <w:t>/</w:t>
+      </w:r>
+    </w:p>
+    <w:p>
+      <w:pPr>
+        <w:rPr>
+          <w:lang w:val="pt-BR"/>
+        </w:rPr>
+      </w:pPr>
+      <w:r>
+        <w:rPr>
+          <w:lang w:val="pt-BR"/>
+        </w:rPr>
+        <w:t xml:space="preserve">        </w:t>
+      </w:r>
+      <w:r>
+        <w:rPr>
+          <w:rFonts w:ascii="Arial" w:hAnsi="Arial" w:cs="Arial"/>
+          <w:lang w:val="pt-BR"/>
+        </w:rPr>
+        <w:t>├</w:t>
+      </w:r>
+      <w:r>
+        <w:rPr>
+          <w:rFonts w:ascii="Aptos" w:hAnsi="Aptos" w:cs="Aptos"/>
+          <w:lang w:val="pt-BR"/>
+        </w:rPr>
+        <w:t>──</w:t>
+      </w:r>
+      <w:r>
+        <w:rPr>
+          <w:lang w:val="pt-BR"/>
+        </w:rPr>
+        <w:t xml:space="preserve"> </w:t>
+      </w:r>
+      <w:proofErr w:type="spellStart"/>
+      <w:proofErr w:type="gramStart"/>
+      <w:r>
+        <w:rPr>
+          <w:lang w:val="pt-BR"/>
+        </w:rPr>
+        <w:t>application.properties</w:t>
+      </w:r>
+      <w:proofErr w:type="spellEnd"/>
+      <w:proofErr w:type="gramEnd"/>
+      <w:r>
+        <w:rPr>
+          <w:lang w:val="pt-BR"/>
+        </w:rPr>
+        <w:t xml:space="preserve">             # Configura</w:t>
+      </w:r>
+      <w:r>
+        <w:rPr>
+          <w:rFonts w:ascii="Aptos" w:hAnsi="Aptos" w:cs="Aptos"/>
+          <w:lang w:val="pt-BR"/>
+        </w:rPr>
+        <w:t>çõ</w:t>
+      </w:r>
+      <w:r>
+        <w:rPr>
+          <w:lang w:val="pt-BR"/>
+        </w:rPr>
+        <w:t>es da aplica</w:t>
+      </w:r>
+      <w:r>
+        <w:rPr>
+          <w:rFonts w:ascii="Aptos" w:hAnsi="Aptos" w:cs="Aptos"/>
+          <w:lang w:val="pt-BR"/>
+        </w:rPr>
+        <w:t>çã</w:t>
+      </w:r>
+      <w:r>
+        <w:rPr>
+          <w:lang w:val="pt-BR"/>
+        </w:rPr>
+        <w:t>o</w:t>
+      </w:r>
+    </w:p>
+    <w:p>
+      <w:pPr>
+        <w:rPr>
+          <w:lang w:val="pt-BR"/>
+        </w:rPr>
+      </w:pPr>
+      <w:r>
+        <w:rPr>
+          <w:lang w:val="pt-BR"/>
+        </w:rPr>
+        <w:t xml:space="preserve">        </w:t>
+      </w:r>
+      <w:r>
+        <w:rPr>
+          <w:rFonts w:ascii="Arial" w:hAnsi="Arial" w:cs="Arial"/>
+          <w:lang w:val="pt-BR"/>
+        </w:rPr>
+        <w:t>├</w:t>
+      </w:r>
+      <w:r>
+        <w:rPr>
+          <w:rFonts w:ascii="Aptos" w:hAnsi="Aptos" w:cs="Aptos"/>
+          <w:lang w:val="pt-BR"/>
+        </w:rPr>
+        <w:t>──</w:t>
+      </w:r>
+      <w:r>
+        <w:rPr>
+          <w:lang w:val="pt-BR"/>
+        </w:rPr>
+        <w:t xml:space="preserve"> </w:t>
+      </w:r>
+      <w:proofErr w:type="spellStart"/>
+      <w:r>
+        <w:rPr>
+          <w:lang w:val="pt-BR"/>
+        </w:rPr>
+        <w:t>static</w:t>
+      </w:r>
+      <w:proofErr w:type="spellEnd"/>
+      <w:r>
+        <w:rPr>
+          <w:lang w:val="pt-BR"/>
+        </w:rPr>
+        <w:t>/                            # Arquivos est</w:t>
+      </w:r>
+      <w:r>
+        <w:rPr>
+          <w:rFonts w:ascii="Aptos" w:hAnsi="Aptos" w:cs="Aptos"/>
+          <w:lang w:val="pt-BR"/>
+        </w:rPr>
+        <w:t>á</w:t>
+      </w:r>
+      <w:r>
+        <w:rPr>
+          <w:lang w:val="pt-BR"/>
+        </w:rPr>
+        <w:t xml:space="preserve">ticos (se servir </w:t>
+      </w:r>
+      <w:proofErr w:type="spellStart"/>
+      <w:r>
+        <w:rPr>
+          <w:lang w:val="pt-BR"/>
+        </w:rPr>
+        <w:t>frontend</w:t>
+      </w:r>
+      <w:proofErr w:type="spellEnd"/>
+      <w:r>
+        <w:rPr>
+          <w:lang w:val="pt-BR"/>
+        </w:rPr>
+        <w:t>)</w:t>
+      </w:r>
+    </w:p>
+    <w:p>
+      <w:pPr>
+        <w:rPr>
+          <w:lang w:val="pt-BR"/>
+        </w:rPr>
+      </w:pPr>
+      <w:r>
+        <w:rPr>
+          <w:lang w:val="pt-BR"/>
+        </w:rPr>
+        <w:t xml:space="preserve">        </w:t>
+      </w:r>
+      <w:r>
+        <w:rPr>
+          <w:rFonts w:ascii="Arial" w:hAnsi="Arial" w:cs="Arial"/>
+          <w:lang w:val="pt-BR"/>
+        </w:rPr>
+        <w:t>├</w:t>
+      </w:r>
+      <w:r>
+        <w:rPr>
+          <w:rFonts w:ascii="Aptos" w:hAnsi="Aptos" w:cs="Aptos"/>
+          <w:lang w:val="pt-BR"/>
+        </w:rPr>
+        <w:t>──</w:t>
+      </w:r>
+      <w:r>
+        <w:rPr>
+          <w:lang w:val="pt-BR"/>
+        </w:rPr>
+        <w:t xml:space="preserve"> </w:t>
+      </w:r>
+      <w:proofErr w:type="spellStart"/>
+      <w:r>
+        <w:rPr>
+          <w:lang w:val="pt-BR"/>
+        </w:rPr>
+        <w:t>templates</w:t>
+      </w:r>
+      <w:proofErr w:type="spellEnd"/>
+      <w:r>
+        <w:rPr>
+          <w:lang w:val="pt-BR"/>
+        </w:rPr>
+        <w:t xml:space="preserve">/                         # </w:t>
+      </w:r>
+      <w:proofErr w:type="spellStart"/>
+      <w:r>
+        <w:rPr>
+          <w:lang w:val="pt-BR"/>
+        </w:rPr>
+        <w:t>Templates</w:t>
+      </w:r>
+      <w:proofErr w:type="spellEnd"/>
+      <w:r>
+        <w:rPr>
+          <w:lang w:val="pt-BR"/>
+        </w:rPr>
+        <w:t xml:space="preserve"> (se usar </w:t>
+      </w:r>
+      <w:proofErr w:type="spellStart"/>
+      <w:r>
+        <w:rPr>
+          <w:lang w:val="pt-BR"/>
+        </w:rPr>
+        <w:t>Thymeleaf</w:t>
+      </w:r>
+      <w:proofErr w:type="spellEnd"/>
+      <w:r>
+        <w:rPr>
+          <w:lang w:val="pt-BR"/>
+        </w:rPr>
+        <w:t>)</w:t>
+      </w:r>
+    </w:p>
+    <w:p>
+      <w:r>
+        <w:rPr>
+          <w:lang w:val="pt-BR"/>
+        </w:rPr>
+        <w:t xml:space="preserve">        </w:t>
+      </w:r>
+      <w:r>
+        <w:t xml:space="preserve">└── </w:t>
+      </w:r>
+      <w:proofErr w:type="spellStart"/>
+      <w:r>
+        <w:t>db</w:t>
+      </w:r>
+      <w:proofErr w:type="spellEnd"/>
+      <w:r>
+        <w:t>/</w:t>
+      </w:r>
+    </w:p>
+    <w:p>
+      <w:r>
+        <w:t xml:space="preserve">            └── migration/                     # Scripts Flyway </w:t>
+      </w:r>
+      <w:proofErr w:type="spellStart"/>
+      <w:r>
+        <w:t>ou</w:t>
+      </w:r>
+      <w:proofErr w:type="spellEnd"/>
+      <w:r>
+        <w:t xml:space="preserve"> Liquibase</w:t>
+      </w:r>
+    </w:p>
+    <w:p/>
+    <w:p>
+      <w:r>
+        <w:t>└── test/</w:t>
+      </w:r>
+    </w:p>
+    <w:p>
+      <w:r>
+        <w:t xml:space="preserve">    └── java/</w:t>
+      </w:r>
+    </w:p>
+    <w:p>
+      <w:r>
+        <w:t xml:space="preserve">        └── com/</w:t>
+      </w:r>
+    </w:p>
+    <w:p>
+      <w:r>
+        <w:t xml:space="preserve">            └── </w:t>
+      </w:r>
+      <w:proofErr w:type="spellStart"/>
+      <w:r>
+        <w:t>seuempresa</w:t>
+      </w:r>
+      <w:proofErr w:type="spellEnd"/>
+      <w:r>
+        <w:t>/</w:t>
+      </w:r>
+    </w:p>
+    <w:p>
+      <w:r>
+        <w:t xml:space="preserve">                └── </w:t>
+      </w:r>
+      <w:proofErr w:type="spellStart"/>
+      <w:r>
+        <w:t>seuprojeto</w:t>
+      </w:r>
+      <w:proofErr w:type="spellEnd"/>
+      <w:r>
+        <w:t>/</w:t>
+      </w:r>
+    </w:p>
+    <w:p>
+      <w:pPr>
+        <w:rPr>
+          <w:lang w:val="pt-BR"/>
+        </w:rPr>
+      </w:pPr>
+      <w:r>
+        <w:t xml:space="preserve">                    </w:t>
+      </w:r>
+      <w:r>
+        <w:rPr>
+          <w:rFonts w:ascii="Arial" w:hAnsi="Arial" w:cs="Arial"/>
+          <w:lang w:val="pt-BR"/>
+        </w:rPr>
+        <w:t>├</w:t>
+      </w:r>
+      <w:r>
+        <w:rPr>
+          <w:rFonts w:ascii="Aptos" w:hAnsi="Aptos" w:cs="Aptos"/>
+          <w:lang w:val="pt-BR"/>
+        </w:rPr>
+        <w:t>──</w:t>
+      </w:r>
+      <w:r>
+        <w:rPr>
+          <w:lang w:val="pt-BR"/>
+        </w:rPr>
+        <w:t xml:space="preserve"> </w:t>
+      </w:r>
+      <w:proofErr w:type="spellStart"/>
+      <w:r>
+        <w:rPr>
+          <w:lang w:val="pt-BR"/>
+        </w:rPr>
+        <w:t>controller</w:t>
+      </w:r>
+      <w:proofErr w:type="spellEnd"/>
+      <w:r>
+        <w:rPr>
+          <w:lang w:val="pt-BR"/>
+        </w:rPr>
+        <w:t>/</w:t>
+      </w:r>
+    </w:p>
+    <w:p>
+      <w:pPr>
+        <w:rPr>
+          <w:lang w:val="pt-BR"/>
+        </w:rPr>
+      </w:pPr>
+      <w:r>
+        <w:rPr>
+          <w:lang w:val="pt-BR"/>
+        </w:rPr>
+        <w:t xml:space="preserve">                    </w:t>
+      </w:r>
+      <w:r>
+        <w:rPr>
+          <w:rFonts w:ascii="Arial" w:hAnsi="Arial" w:cs="Arial"/>
+          <w:lang w:val="pt-BR"/>
+        </w:rPr>
+        <w:t>├</w:t>
+      </w:r>
+      <w:r>
+        <w:rPr>
+          <w:rFonts w:ascii="Aptos" w:hAnsi="Aptos" w:cs="Aptos"/>
+          <w:lang w:val="pt-BR"/>
+        </w:rPr>
+        <w:t>──</w:t>
+      </w:r>
+      <w:r>
+        <w:rPr>
+          <w:lang w:val="pt-BR"/>
+        </w:rPr>
+        <w:t xml:space="preserve"> </w:t>
+      </w:r>
+      <w:proofErr w:type="spellStart"/>
+      <w:r>
+        <w:rPr>
+          <w:lang w:val="pt-BR"/>
+        </w:rPr>
+        <w:t>service</w:t>
+      </w:r>
+      <w:proofErr w:type="spellEnd"/>
+      <w:r>
+        <w:rPr>
+          <w:lang w:val="pt-BR"/>
+        </w:rPr>
+        <w:t>/</w:t>
+      </w:r>
+    </w:p>
+    <w:p>
+      <w:pPr>
+        <w:rPr>
+          <w:lang w:val="pt-BR"/>
+        </w:rPr>
+      </w:pPr>
+      <w:r>
+        <w:rPr>
+          <w:lang w:val="pt-BR"/>
+        </w:rPr>
+        <w:t xml:space="preserve">                    </w:t>
+      </w:r>
+      <w:r>
+        <w:rPr>
+          <w:rFonts w:ascii="Arial" w:hAnsi="Arial" w:cs="Arial"/>
+          <w:lang w:val="pt-BR"/>
+        </w:rPr>
+        <w:t>├</w:t>
+      </w:r>
+      <w:r>
+        <w:rPr>
+          <w:rFonts w:ascii="Aptos" w:hAnsi="Aptos" w:cs="Aptos"/>
+          <w:lang w:val="pt-BR"/>
+        </w:rPr>
+        <w:t>──</w:t>
+      </w:r>
+      <w:r>
+        <w:rPr>
+          <w:lang w:val="pt-BR"/>
+        </w:rPr>
+        <w:t xml:space="preserve"> </w:t>
+      </w:r>
+      <w:proofErr w:type="spellStart"/>
+      <w:r>
+        <w:rPr>
+          <w:lang w:val="pt-BR"/>
+        </w:rPr>
+        <w:t>repository</w:t>
+      </w:r>
+      <w:proofErr w:type="spellEnd"/>
+      <w:r>
+        <w:rPr>
+          <w:lang w:val="pt-BR"/>
+        </w:rPr>
+        <w:t>/</w:t>
+      </w:r>
+    </w:p>
+    <w:p>
+      <w:pPr>
+        <w:rPr>
+          <w:lang w:val="pt-BR"/>
+        </w:rPr>
+      </w:pPr>
+      <w:r>
+        <w:rPr>
+          <w:lang w:val="pt-BR"/>
+        </w:rPr>
+        <w:t xml:space="preserve">                    └── </w:t>
+      </w:r>
+      <w:proofErr w:type="spellStart"/>
+      <w:r>
+        <w:rPr>
+          <w:lang w:val="pt-BR"/>
+        </w:rPr>
+        <w:t>integration</w:t>
+      </w:r>
+      <w:proofErr w:type="spellEnd"/>
+      <w:r>
+        <w:rPr>
+          <w:lang w:val="pt-BR"/>
+        </w:rPr>
+        <w:t>/</w:t>
+      </w:r>
+    </w:p>
+    <w:p>
+      <w:pPr>
+        <w:rPr>
           <w:lang w:val="pt-BR"/>
         </w:rPr>
       </w:pPr>
@@ -3292,6 +5511,7 @@
           <w:b/>
           <w:bCs/>
         </w:rPr>
+        <w:lastRenderedPageBreak/>
         <w:t>improviso</w:t>
       </w:r>
       <w:proofErr w:type="spellEnd"/>
@@ -3853,7 +6073,6 @@
           <w:b/>
           <w:bCs/>
         </w:rPr>
-        <w:lastRenderedPageBreak/>
         <w:t>Solução</w:t>
       </w:r>
       <w:proofErr w:type="spellEnd"/>
@@ -4167,6 +6386,7 @@
           <w:bCs/>
           <w:lang w:val="pt-BR"/>
         </w:rPr>
+        <w:lastRenderedPageBreak/>
         <w:t>2.2 Comunicação Estruturada</w:t>
       </w:r>
     </w:p>
@@ -4622,7 +6842,6 @@
           <w:b/>
           <w:bCs/>
         </w:rPr>
-        <w:lastRenderedPageBreak/>
         <w:t>Solução</w:t>
       </w:r>
       <w:proofErr w:type="spellEnd"/>
@@ -4902,6 +7121,7 @@
           <w:bCs/>
           <w:lang w:val="pt-BR"/>
         </w:rPr>
+        <w:lastRenderedPageBreak/>
         <w:t>2.4 Transparência Administrativa</w:t>
       </w:r>
     </w:p>
@@ -5460,7 +7680,6 @@
           <w:b/>
           <w:bCs/>
         </w:rPr>
-        <w:lastRenderedPageBreak/>
         <w:t>decisões</w:t>
       </w:r>
       <w:proofErr w:type="spellEnd"/>
@@ -5781,6 +8000,7 @@
           <w:b/>
           <w:bCs/>
         </w:rPr>
+        <w:lastRenderedPageBreak/>
         <w:t>Voto</w:t>
       </w:r>
       <w:proofErr w:type="spellEnd"/>
@@ -6481,7 +8701,6 @@
           <w:b/>
           <w:bCs/>
         </w:rPr>
-        <w:lastRenderedPageBreak/>
         <w:t>Histórico</w:t>
       </w:r>
       <w:proofErr w:type="spellEnd"/>
@@ -6808,6 +9027,7 @@
           <w:b/>
           <w:bCs/>
         </w:rPr>
+        <w:lastRenderedPageBreak/>
         <w:t>Registro</w:t>
       </w:r>
       <w:proofErr w:type="spellEnd"/>
@@ -7394,7 +9614,6 @@
           <w:b/>
           <w:bCs/>
         </w:rPr>
-        <w:lastRenderedPageBreak/>
         <w:t xml:space="preserve">Ata é </w:t>
       </w:r>
       <w:proofErr w:type="spellStart"/>
@@ -7664,6 +9883,7 @@
           <w:b/>
           <w:bCs/>
         </w:rPr>
+        <w:lastRenderedPageBreak/>
         <w:t>Síndico</w:t>
       </w:r>
       <w:proofErr w:type="spellEnd"/>
@@ -8287,7 +10507,6 @@
           <w:b/>
           <w:bCs/>
         </w:rPr>
-        <w:lastRenderedPageBreak/>
         <w:pict w14:anchorId="6B3137E9">
           <v:rect id="_x0000_i1050" style="width:0;height:1.5pt" o:hralign="center" o:hrstd="t" o:hr="t" fillcolor="#a0a0a0" stroked="f"/>
         </w:pict>
@@ -8555,6 +10774,7 @@
           <w:bCs/>
           <w:lang w:val="pt-BR"/>
         </w:rPr>
+        <w:lastRenderedPageBreak/>
         <w:t>Planos Mensais:</w:t>
       </w:r>
     </w:p>

</xml_diff>